<commit_message>
Paper 6: Ologunbaba first author
</commit_message>
<xml_diff>
--- a/manuscript/Paper7_Ologunbaba.docx
+++ b/manuscript/Paper7_Ologunbaba.docx
@@ -181,7 +181,7 @@
         <w:t xml:space="preserve"> </w:t>
       </w:r>
       <w:r>
-        <w:t xml:space="preserve">On the public Medical Expenditure Panel Survey benchmark of Babalola et al. (2026), 43,963 persons in panels 23 to 27 with year-1 predictors and year-2 spending, we simulate a strategic plan with more information than the regulator. It adds diagnosis codes where the payment rise exceeds a cost that grows with how often it has used the code, among codes plausible for the person and within a limited chart-review reach, and it tilts enrollment toward people its own cross-fitted cost model, which also sees health-risk-assessment information, expects to be overpaid. Both channels are calibrated jointly, on training data, to MedPAC’s published magnitudes. We compare a payment formula in the form used by CMS with a coding penalty, caps at each code’s incremental cost, a distributionally robust penalty on the worst-priced subgroup and gradient boosting; with each formula retrained against the plan by repeated risk minimization; and with a coding penalty whose weight is chosen against the plan’s best response (a Stackelberg choice). The plan always responds out of sample and every formula pays the same budget. All quantities are out of sample, with a PSU bootstrap paired across formulas.</w:t>
+        <w:t xml:space="preserve">On the public Medical Expenditure Panel Survey benchmark of Ologunbaba et al. (2026), 43,963 persons in panels 23 to 27 with year-1 predictors and year-2 spending, we simulate a strategic plan with more information than the regulator. It adds diagnosis codes where the payment rise exceeds a cost that grows with how often it has used the code, among codes plausible for the person and within a limited chart-review reach, and it tilts enrollment toward people its own cross-fitted cost model, which also sees health-risk-assessment information, expects to be overpaid. Both channels are calibrated jointly, on training data, to MedPAC’s published magnitudes. We compare a payment formula in the form used by CMS with a coding penalty, caps at each code’s incremental cost, a distributionally robust penalty on the worst-priced subgroup and gradient boosting; with each formula retrained against the plan by repeated risk minimization; and with a coding penalty whose weight is chosen against the plan’s best response (a Stackelberg choice). The plan always responds out of sample and every formula pays the same budget. All quantities are out of sample, with a PSU bootstrap paired across formulas.</w:t>
       </w:r>
     </w:p>
     <w:p>
@@ -286,7 +286,7 @@
         <w:pStyle w:val="BodyText"/>
       </w:pPr>
       <w:r>
-        <w:t xml:space="preserve">This paper applies them. A companion study benchmarked ten risk-adjustment models on the Medical Expenditure Panel Survey (MEPS) and measured how much each pays for an added diagnosis code and which groups each underpays (Babalola et al., 2026). It treated the plan as passive. Here the plan is strategic: it best-responds to any formula by coding and by selection, calibrated so that its response to a CMS-form formula matches MedPAC’s figures. We ask four questions.</w:t>
+        <w:t xml:space="preserve">This paper applies them. A companion study benchmarked ten risk-adjustment models on the Medical Expenditure Panel Survey (MEPS) and measured how much each pays for an added diagnosis code and which groups each underpays (Ologunbaba et al., 2026). It treated the plan as passive. Here the plan is strategic: it best-responds to any formula by coding and by selection, calibrated so that its response to a CMS-form formula matches MedPAC’s figures. We ask four questions.</w:t>
       </w:r>
     </w:p>
     <w:p>
@@ -432,7 +432,7 @@
         <w:pStyle w:val="FirstParagraph"/>
       </w:pPr>
       <w:r>
-        <w:t xml:space="preserve">Everything in this section comes from the companion benchmark (Babalola et al., 2026) and is reused without change, so every result here is comparable with it. The data are five two-year MEPS panels (23 to 27, 2018 to 2023), 43,963 persons, with year-1 characteristics predicting year-2 total spending in 2024 dollars. People who died in year 2 are kept, with spending annualized by months in scope and weights multiplied by the same fraction. Conditions are the 124 three-digit Clinical Classifications Software Refined (CCSR) categories held by at least 0.5% of the sample, with counts of conditions and of body systems.</w:t>
+        <w:t xml:space="preserve">Everything in this section comes from the companion benchmark (Ologunbaba et al., 2026) and is reused without change, so every result here is comparable with it. The data are five two-year MEPS panels (23 to 27, 2018 to 2023), 43,963 persons, with year-1 characteristics predicting year-2 total spending in 2024 dollars. People who died in year 2 are kept, with spending annualized by months in scope and weights multiplied by the same fraction. Conditions are the 124 three-digit Clinical Classifications Software Refined (CCSR) categories held by at least 0.5% of the sample, with counts of conditions and of body systems.</w:t>
       </w:r>
     </w:p>
     <w:p>
@@ -1389,7 +1389,7 @@
         <w:t xml:space="preserve"> </w:t>
       </w:r>
       <w:r>
-        <w:t xml:space="preserve">The 2024 model constrained some condition categories and removed discretionary codes. The results here say which levers work. Capping a code at an estimate of what it is worth does not deter coding: the regression already pays less than such estimates, and a code added for payment changes nothing about cost, so any positive payment is extractable. Shrinking the payment for codes in proportion to how easily they can be added does deter it, at almost no loss of accuracy, and spreads what coding remains thinly across all codes; the count of conditions must be penalized with the flags, although it still gains some of the payment the flags lose. Choosing the size of that penalty against the plan’s anticipated response, rather than by fit alone, gives a little more protection. Refitting against the coding the formula induces helps an unprotected formula but never settles, and it adds nothing once the penalty is in place; what looks like a larger gain from retraining is the coding adjustment that normalizing on gamed data builds in. None of this touches favorable selection, which is the larger channel here. Selection is driven by what the plan knows and the formula does not, and the remedies lie outside the formula: risk corridors, reinsurance, or payment on a broader information set, with the incentive problems prior use brings (Babalola et al., 2026).</w:t>
+        <w:t xml:space="preserve">The 2024 model constrained some condition categories and removed discretionary codes. The results here say which levers work. Capping a code at an estimate of what it is worth does not deter coding: the regression already pays less than such estimates, and a code added for payment changes nothing about cost, so any positive payment is extractable. Shrinking the payment for codes in proportion to how easily they can be added does deter it, at almost no loss of accuracy, and spreads what coding remains thinly across all codes; the count of conditions must be penalized with the flags, although it still gains some of the payment the flags lose. Choosing the size of that penalty against the plan’s anticipated response, rather than by fit alone, gives a little more protection. Refitting against the coding the formula induces helps an unprotected formula but never settles, and it adds nothing once the penalty is in place; what looks like a larger gain from retraining is the coding adjustment that normalizing on gamed data builds in. None of this touches favorable selection, which is the larger channel here. Selection is driven by what the plan knows and the formula does not, and the remedies lie outside the formula: risk corridors, reinsurance, or payment on a broader information set, with the incentive problems prior use brings (Ologunbaba et al., 2026).</w:t>
       </w:r>
     </w:p>
     <w:p>
@@ -1617,7 +1617,7 @@
         <w:t xml:space="preserve"> </w:t>
       </w:r>
       <w:r>
-        <w:t xml:space="preserve">The Medical Expenditure Panel Survey public-use files are available from the Agency for Healthcare Research and Quality. No microdata are redistributed. The derived analysis file is built by the code of Babalola et al. (2026).</w:t>
+        <w:t xml:space="preserve">The Medical Expenditure Panel Survey public-use files are available from the Agency for Healthcare Research and Quality. No microdata are redistributed. The derived analysis file is built by the code of Ologunbaba et al. (2026).</w:t>
       </w:r>
     </w:p>
     <w:p>
@@ -1722,7 +1722,7 @@
         <w:rPr>
           <w:sz w:val="19"/>
         </w:rPr>
-        <w:t xml:space="preserve">Babalola, O. D., Adiegwu, C. G., &amp; Olamilekan, E. Z. (2026). Interpretable and fair machine learning for health-cost prediction and risk adjustment: a reproducible benchmark on public data and an open-source toolkit. Working paper, Georgia State University.</w:t>
+        <w:t xml:space="preserve">Ologunbaba, T., Babalola, O. D., Adiegwu, C. G., &amp; Olamilekan, E. Z. (2026). Interpretable and fair machine learning for health-cost prediction and risk adjustment: a reproducible benchmark on public data and an open-source toolkit. Working paper, Georgia State University.</w:t>
       </w:r>
     </w:p>
     <w:p>
@@ -2537,7 +2537,7 @@
           <w:iCs/>
           <w:sz w:val="19"/>
         </w:rPr>
-        <w:t xml:space="preserve">DOIs were verified against the Crossref REST API. PMLR proceedings have no DOI and are cited by their proceedings pages. MedPAC figures are those checked against the chapter text in Babalola et al. (2026).</w:t>
+        <w:t xml:space="preserve">DOIs were verified against the Crossref REST API. PMLR proceedings have no DOI and are cited by their proceedings pages. MedPAC figures are those checked against the chapter text in Ologunbaba et al. (2026).</w:t>
       </w:r>
     </w:p>
     <w:bookmarkEnd w:id="47"/>

</xml_diff>

<commit_message>
Update author affiliations and add publication dates
</commit_message>
<xml_diff>
--- a/manuscript/Paper7_Ologunbaba.docx
+++ b/manuscript/Paper7_Ologunbaba.docx
@@ -72,7 +72,7 @@
         <w:jc w:val="left"/>
       </w:pPr>
       <w:r>
-        <w:t xml:space="preserve">¹ Department of Electrical Engineering, Federal University of Technology, Akure, Nigeria.</w:t>
+        <w:t xml:space="preserve">¹ Independent researcher.</w:t>
       </w:r>
     </w:p>
     <w:p>
@@ -81,7 +81,7 @@
         <w:jc w:val="left"/>
       </w:pPr>
       <w:r>
-        <w:t xml:space="preserve">² Department of Actuarial Science and Quantitative Risk Analysis and Management, Georgia State University, Atlanta, GA, USA.</w:t>
+        <w:t xml:space="preserve">² Maurice R. Greenberg School of Risk Science, J. Mack Robinson College of Business, Georgia State University, Atlanta, GA, USA.</w:t>
       </w:r>
     </w:p>
     <w:p>
@@ -110,6 +110,24 @@
       </w:r>
       <w:r>
         <w:t xml:space="preserve">Temitope Ologunbaba: ologunbabatope@gmail.com; Chisom G. Adiegwu: Cadiegwu1@student.gsu.edu; Adebolu Temitope: temitopeadebolu5@gmail.com.</w:t>
+      </w:r>
+    </w:p>
+    <w:p>
+      <w:pPr>
+        <w:pStyle w:val="BodyText"/>
+      </w:pPr>
+      <w:r>
+        <w:rPr>
+          <w:b/>
+          <w:bCs/>
+        </w:rPr>
+        <w:t xml:space="preserve">Date.</w:t>
+      </w:r>
+      <w:r>
+        <w:t xml:space="preserve"> </w:t>
+      </w:r>
+      <w:r>
+        <w:t xml:space="preserve">September 2026.</w:t>
       </w:r>
     </w:p>
     <w:p>
@@ -1722,7 +1740,7 @@
         <w:rPr>
           <w:sz w:val="19"/>
         </w:rPr>
-        <w:t xml:space="preserve">Ologunbaba, T., Olamilekan, E. Z., Babalola, O. D., &amp; Adiegwu, C. G. (2026). Interpretable and fair machine learning for health-cost prediction and risk adjustment: a reproducible benchmark on public data and an open-source toolkit. Working paper, Georgia State University.</w:t>
+        <w:t xml:space="preserve">Ologunbaba, T., Olamilekan, E. Z., Babalola, O. D., &amp; Adiegwu, C. G. (2026). Interpretable and fair machine learning for health-cost prediction and risk adjustment: a reproducible benchmark on public data and an open-source toolkit. Working paper.</w:t>
       </w:r>
     </w:p>
     <w:p>

</xml_diff>

<commit_message>
Set publication dates to match data release dates
</commit_message>
<xml_diff>
--- a/manuscript/Paper7_Ologunbaba.docx
+++ b/manuscript/Paper7_Ologunbaba.docx
@@ -127,7 +127,7 @@
         <w:t xml:space="preserve"> </w:t>
       </w:r>
       <w:r>
-        <w:t xml:space="preserve">September 2026.</w:t>
+        <w:t xml:space="preserve">August 2026.</w:t>
       </w:r>
     </w:p>
     <w:p>
@@ -199,7 +199,7 @@
         <w:t xml:space="preserve"> </w:t>
       </w:r>
       <w:r>
-        <w:t xml:space="preserve">On the public Medical Expenditure Panel Survey benchmark of Ologunbaba et al. (2026), 43,963 persons in panels 23 to 27 with year-1 predictors and year-2 spending, we simulate a strategic plan with more information than the regulator. It adds diagnosis codes where the payment rise exceeds a cost that grows with how often it has used the code, among codes plausible for the person and within a limited chart-review reach, and it tilts enrollment toward people its own cross-fitted cost model, which also sees health-risk-assessment information, expects to be overpaid. Both channels are calibrated jointly, on training data, to MedPAC’s published magnitudes. We compare a payment formula in the form used by CMS with a coding penalty, caps at each code’s incremental cost, a distributionally robust penalty on the worst-priced subgroup and gradient boosting; with each formula retrained against the plan by repeated risk minimization; and with a coding penalty whose weight is chosen against the plan’s best response (a Stackelberg choice). The plan always responds out of sample and every formula pays the same budget. All quantities are out of sample, with a PSU bootstrap paired across formulas.</w:t>
+        <w:t xml:space="preserve">On the public Medical Expenditure Panel Survey benchmark of Ologunbaba et al. (2025), 43,963 persons in panels 23 to 27 with year-1 predictors and year-2 spending, we simulate a strategic plan with more information than the regulator. It adds diagnosis codes where the payment rise exceeds a cost that grows with how often it has used the code, among codes plausible for the person and within a limited chart-review reach, and it tilts enrollment toward people its own cross-fitted cost model, which also sees health-risk-assessment information, expects to be overpaid. Both channels are calibrated jointly, on training data, to MedPAC’s published magnitudes. We compare a payment formula in the form used by CMS with a coding penalty, caps at each code’s incremental cost, a distributionally robust penalty on the worst-priced subgroup and gradient boosting; with each formula retrained against the plan by repeated risk minimization; and with a coding penalty whose weight is chosen against the plan’s best response (a Stackelberg choice). The plan always responds out of sample and every formula pays the same budget. All quantities are out of sample, with a PSU bootstrap paired across formulas.</w:t>
       </w:r>
     </w:p>
     <w:p>
@@ -304,7 +304,7 @@
         <w:pStyle w:val="BodyText"/>
       </w:pPr>
       <w:r>
-        <w:t xml:space="preserve">This paper applies them. A companion study benchmarked ten risk-adjustment models on the Medical Expenditure Panel Survey (MEPS) and measured how much each pays for an added diagnosis code and which groups each underpays (Ologunbaba et al., 2026). It treated the plan as passive. Here the plan is strategic: it best-responds to any formula by coding and by selection, calibrated so that its response to a CMS-form formula matches MedPAC’s figures. We ask four questions.</w:t>
+        <w:t xml:space="preserve">This paper applies them. A companion study benchmarked ten risk-adjustment models on the Medical Expenditure Panel Survey (MEPS) and measured how much each pays for an added diagnosis code and which groups each underpays (Ologunbaba et al., 2025). It treated the plan as passive. Here the plan is strategic: it best-responds to any formula by coding and by selection, calibrated so that its response to a CMS-form formula matches MedPAC’s figures. We ask four questions.</w:t>
       </w:r>
     </w:p>
     <w:p>
@@ -450,7 +450,7 @@
         <w:pStyle w:val="FirstParagraph"/>
       </w:pPr>
       <w:r>
-        <w:t xml:space="preserve">Everything in this section comes from the companion benchmark (Ologunbaba et al., 2026) and is reused without change, so every result here is comparable with it. The data are five two-year MEPS panels (23 to 27, 2018 to 2023), 43,963 persons, with year-1 characteristics predicting year-2 total spending in 2024 dollars. People who died in year 2 are kept, with spending annualized by months in scope and weights multiplied by the same fraction. Conditions are the 124 three-digit Clinical Classifications Software Refined (CCSR) categories held by at least 0.5% of the sample, with counts of conditions and of body systems.</w:t>
+        <w:t xml:space="preserve">Everything in this section comes from the companion benchmark (Ologunbaba et al., 2025) and is reused without change, so every result here is comparable with it. The data are five two-year MEPS panels (23 to 27, 2018 to 2023), 43,963 persons, with year-1 characteristics predicting year-2 total spending in 2024 dollars. People who died in year 2 are kept, with spending annualized by months in scope and weights multiplied by the same fraction. Conditions are the 124 three-digit Clinical Classifications Software Refined (CCSR) categories held by at least 0.5% of the sample, with counts of conditions and of body systems.</w:t>
       </w:r>
     </w:p>
     <w:p>
@@ -1407,7 +1407,7 @@
         <w:t xml:space="preserve"> </w:t>
       </w:r>
       <w:r>
-        <w:t xml:space="preserve">The 2024 model constrained some condition categories and removed discretionary codes. The results here say which levers work. Capping a code at an estimate of what it is worth does not deter coding: the regression already pays less than such estimates, and a code added for payment changes nothing about cost, so any positive payment is extractable. Shrinking the payment for codes in proportion to how easily they can be added does deter it, at almost no loss of accuracy, and spreads what coding remains thinly across all codes; the count of conditions must be penalized with the flags, although it still gains some of the payment the flags lose. Choosing the size of that penalty against the plan’s anticipated response, rather than by fit alone, gives a little more protection. Refitting against the coding the formula induces helps an unprotected formula but never settles, and it adds nothing once the penalty is in place; what looks like a larger gain from retraining is the coding adjustment that normalizing on gamed data builds in. None of this touches favorable selection, which is the larger channel here. Selection is driven by what the plan knows and the formula does not, and the remedies lie outside the formula: risk corridors, reinsurance, or payment on a broader information set, with the incentive problems prior use brings (Ologunbaba et al., 2026).</w:t>
+        <w:t xml:space="preserve">The 2024 model constrained some condition categories and removed discretionary codes. The results here say which levers work. Capping a code at an estimate of what it is worth does not deter coding: the regression already pays less than such estimates, and a code added for payment changes nothing about cost, so any positive payment is extractable. Shrinking the payment for codes in proportion to how easily they can be added does deter it, at almost no loss of accuracy, and spreads what coding remains thinly across all codes; the count of conditions must be penalized with the flags, although it still gains some of the payment the flags lose. Choosing the size of that penalty against the plan’s anticipated response, rather than by fit alone, gives a little more protection. Refitting against the coding the formula induces helps an unprotected formula but never settles, and it adds nothing once the penalty is in place; what looks like a larger gain from retraining is the coding adjustment that normalizing on gamed data builds in. None of this touches favorable selection, which is the larger channel here. Selection is driven by what the plan knows and the formula does not, and the remedies lie outside the formula: risk corridors, reinsurance, or payment on a broader information set, with the incentive problems prior use brings (Ologunbaba et al., 2025).</w:t>
       </w:r>
     </w:p>
     <w:p>
@@ -1635,7 +1635,7 @@
         <w:t xml:space="preserve"> </w:t>
       </w:r>
       <w:r>
-        <w:t xml:space="preserve">The Medical Expenditure Panel Survey public-use files are available from the Agency for Healthcare Research and Quality. No microdata are redistributed. The derived analysis file is built by the code of Ologunbaba et al. (2026).</w:t>
+        <w:t xml:space="preserve">The Medical Expenditure Panel Survey public-use files are available from the Agency for Healthcare Research and Quality. No microdata are redistributed. The derived analysis file is built by the code of Ologunbaba et al. (2025).</w:t>
       </w:r>
     </w:p>
     <w:p>
@@ -1740,7 +1740,7 @@
         <w:rPr>
           <w:sz w:val="19"/>
         </w:rPr>
-        <w:t xml:space="preserve">Ologunbaba, T., Olamilekan, E. Z., Babalola, O. D., &amp; Adiegwu, C. G. (2026). Interpretable and fair machine learning for health-cost prediction and risk adjustment: a reproducible benchmark on public data and an open-source toolkit. Working paper.</w:t>
+        <w:t xml:space="preserve">Ologunbaba, T., Olamilekan, E. Z., Babalola, O. D., &amp; Adiegwu, C. G. (2025). Interpretable and fair machine learning for health-cost prediction and risk adjustment: a reproducible benchmark on public data and an open-source toolkit. Working paper.</w:t>
       </w:r>
     </w:p>
     <w:p>
@@ -2555,7 +2555,7 @@
           <w:iCs/>
           <w:sz w:val="19"/>
         </w:rPr>
-        <w:t xml:space="preserve">DOIs were verified against the Crossref REST API. PMLR proceedings have no DOI and are cited by their proceedings pages. MedPAC figures are those checked against the chapter text in Ologunbaba et al. (2026).</w:t>
+        <w:t xml:space="preserve">DOIs were verified against the Crossref REST API. PMLR proceedings have no DOI and are cited by their proceedings pages. MedPAC figures are those checked against the chapter text in Ologunbaba et al. (2025).</w:t>
       </w:r>
     </w:p>
     <w:bookmarkEnd w:id="47"/>

</xml_diff>

<commit_message>
Set submission date and author affiliations
</commit_message>
<xml_diff>
--- a/manuscript/Paper7_Ologunbaba.docx
+++ b/manuscript/Paper7_Ologunbaba.docx
@@ -50,7 +50,7 @@
         <w:t xml:space="preserve">Chisom G. Adiegwu</w:t>
       </w:r>
       <w:r>
-        <w:t xml:space="preserve">²,</w:t>
+        <w:t xml:space="preserve">¹,</w:t>
       </w:r>
       <w:r>
         <w:t xml:space="preserve"> </w:t>
@@ -63,7 +63,7 @@
         <w:t xml:space="preserve">Adebolu Temitope</w:t>
       </w:r>
       <w:r>
-        <w:t xml:space="preserve">³</w:t>
+        <w:t xml:space="preserve">²</w:t>
       </w:r>
     </w:p>
     <w:p>
@@ -72,7 +72,7 @@
         <w:jc w:val="left"/>
       </w:pPr>
       <w:r>
-        <w:t xml:space="preserve">¹ Independent researcher.</w:t>
+        <w:t xml:space="preserve">¹ Maurice R. Greenberg School of Risk Science, J. Mack Robinson College of Business, Georgia State University, Atlanta, GA, USA.</w:t>
       </w:r>
     </w:p>
     <w:p>
@@ -81,16 +81,7 @@
         <w:jc w:val="left"/>
       </w:pPr>
       <w:r>
-        <w:t xml:space="preserve">² Maurice R. Greenberg School of Risk Science, J. Mack Robinson College of Business, Georgia State University, Atlanta, GA, USA.</w:t>
-      </w:r>
-    </w:p>
-    <w:p>
-      <w:pPr>
-        <w:pStyle w:val="BodyText"/>
-        <w:jc w:val="left"/>
-      </w:pPr>
-      <w:r>
-        <w:t xml:space="preserve">³ Department of Epidemiology and Medical Statistics, University of Ibadan, Ibadan, Nigeria.</w:t>
+        <w:t xml:space="preserve">² Department of Epidemiology and Medical Statistics, University of Ibadan, Ibadan, Nigeria.</w:t>
       </w:r>
     </w:p>
     <w:p>

</xml_diff>